<commit_message>
Cite official DOSM datasets in Datathon report
</commit_message>
<xml_diff>
--- a/docs/report/404_NOT_FOUND_Datathon2026_Report.docx
+++ b/docs/report/404_NOT_FOUND_Datathon2026_Report.docx
@@ -1550,7 +1550,7 @@
         <w:rPr>
           <w:szCs w:val="24"/>
         </w:rPr>
-        <w:t>This project develops a Tourism Opportunity Gap framework for Malaysia using nine official DOSM datasets. The analytical model estimates the share of domestic visitors associated with a state’s population, economy, employment and accommodation capacity. The result is compared with the state’s observed share of national domestic visitors. A positive gap means the observed share is below the model-expected share; it does not represent guaranteed additional visitors or revenue.</w:t>
+        <w:t>This project develops a Tourism Opportunity Gap framework for Malaysia using nine OpenDOSM-listed dataset groups. The analytical model estimates the share of domestic visitors associated with a state’s population, economy, employment and accommodation capacity. The result is compared with the state’s observed share of national domestic visitors. A positive gap means the observed share is below the model-expected share; it does not represent guaranteed additional visitors or revenue.</w:t>
       </w:r>
     </w:p>
     <w:p>
@@ -1721,7 +1721,7 @@
         <w:rPr>
           <w:szCs w:val="24"/>
         </w:rPr>
-        <w:t>Integrate nine official DOSM datasets and develop an interpretable structural model of expected state-level domestic visitor share.</w:t>
+        <w:t>Integrate nine OpenDOSM-listed dataset groups and develop an interpretable structural model of expected state-level domestic visitor share.</w:t>
       </w:r>
     </w:p>
     <w:p>
@@ -2086,7 +2086,7 @@
         </w:rPr>
       </w:pPr>
       <w:r>
-        <w:t>The source inventory covered nine official DOSM dataset groups (D1–D9). The final structural model used the state-level outcome and predictors from D2, D4, D5, D6, D7 and D8. D1 and D3 supported national context, while D9 was profiled but excluded from the final model. A tenth data.gov.my arrivals dataset was also profiled and excluded because it records state of entry rather than destination and ends in 2024. Table 3.2 summarises the inventory; the full catalogue and publication URLs are retained in the references and ml/data/raw/SOURCES.md.</w:t>
+        <w:t>Nine OpenDOSM-listed dataset groups (D1–D9) were inventoried, consistent with the Datathon booklet's preference for official Malaysian data (Department of Statistics Malaysia, 2026b, p. 9). The selected model used D2 and D4 for domestic-visitor outcomes and accommodation supply, and D5–D8 for state-level structural predictors. D1 and D3 provided national context. D9 water consumption, jointly sourced from SPAN, NRES and DOSM, was profiled but excluded. A tenth data.gov.my arrivals series was also excluded because it measures state of entry rather than destination and ends in 2024. Table 3.2 gives each group's analytical role; the official source pages are identified below and in References.</w:t>
       </w:r>
     </w:p>
     <w:p>
@@ -3647,11 +3647,14 @@
     </w:tbl>
     <w:p>
       <w:pPr>
-        <w:spacing w:after="0"/>
-        <w:rPr>
-          <w:szCs w:val="24"/>
-        </w:rPr>
-      </w:pPr>
+        <w:spacing w:after="0" w:before="120"/>
+        <w:rPr>
+          <w:szCs w:val="24"/>
+        </w:rPr>
+      </w:pPr>
+      <w:r>
+        <w:t>Data provenance: D1–D4 were obtained from DOSM's OpenDOSM Publications (Tourism Satellite Account; Domestic Tourism Survey, annual and quarterly; Domestic Tourism by State). D5–D9 were located in the OpenDOSM Data Catalogue (state CPI; population; real GDP; quarterly labour force; water consumption). Dataset-specific official URLs are listed in References; edition-level download links and file checksums are documented in ml/data/raw/SOURCES.md.</w:t>
+      </w:r>
     </w:p>
     <w:p>
       <w:pPr>
@@ -7120,7 +7123,7 @@
         </w:rPr>
       </w:pPr>
       <w:r>
-        <w:t>This study inventoried nine official DOSM dataset groups and used six state-level groups to estimate how observed domestic visitor shares compare with model-expected shares based on measured structural conditions. On the unseen 2024–2025 holdout, the selected model reduced log-scale MAE by 40.7% relative to the baseline and reduced MAPE from 41.4% to 22.5%. In the separate forecasting comparison, none of the tested ML models outperformed the naive same-as-last-year baseline across rolling-origin folds.</w:t>
+        <w:t>This study inventoried nine OpenDOSM-listed dataset groups and used six state-level groups to estimate how observed domestic visitor shares compare with model-expected shares based on measured structural conditions. On the unseen 2024–2025 holdout, the selected model reduced log-scale MAE by 40.7% relative to the baseline and reduced MAPE from 41.4% to 22.5%. In the separate forecasting comparison, none of the tested ML models outperformed the naive same-as-last-year baseline across rolling-origin folds.</w:t>
       </w:r>
     </w:p>
     <w:p>
@@ -7316,7 +7319,7 @@
         <w:rPr>
           <w:szCs w:val="24"/>
         </w:rPr>
-        <w:t>Department of Statistics Malaysia. (2026b). Datathon 2026 – Booklet Final. Written report format, p. 13; submission rules, p. 12; dashboard, pp. 14–16.</w:t>
+        <w:t>Department of Statistics Malaysia. (2026b). Datathon 2026 – Booklet Final. Data sources rule, p. 9; written report format, p. 13; submission rules, p. 12; dashboard, pp. 14–16.</w:t>
       </w:r>
     </w:p>
     <w:p>

</xml_diff>